<commit_message>
added stage 1 link and date
</commit_message>
<xml_diff>
--- a/paper/Stage2/manuscript.docx
+++ b/paper/Stage2/manuscript.docx
@@ -1201,6 +1201,7 @@
         <w:trPr>
           <w:trHeight w:val="360" w:hRule="auto"/>
         </w:trPr>
+        body1
         <w:tc>
           <w:tcPr>
             <w:tcBorders>
@@ -1314,6 +1315,7 @@
         <w:trPr>
           <w:trHeight w:val="360" w:hRule="auto"/>
         </w:trPr>
+        body2
         <w:tc>
           <w:tcPr>
             <w:tcBorders>
@@ -1427,6 +1429,7 @@
         <w:trPr>
           <w:trHeight w:val="360" w:hRule="auto"/>
         </w:trPr>
+        body3
         <w:tc>
           <w:tcPr>
             <w:tcBorders>
@@ -1540,6 +1543,7 @@
         <w:trPr>
           <w:trHeight w:val="360" w:hRule="auto"/>
         </w:trPr>
+        body4
         <w:tc>
           <w:tcPr>
             <w:tcBorders>
@@ -1653,6 +1657,7 @@
         <w:trPr>
           <w:trHeight w:val="360" w:hRule="auto"/>
         </w:trPr>
+        body5
         <w:tc>
           <w:tcPr>
             <w:tcBorders>
@@ -1766,6 +1771,7 @@
         <w:trPr>
           <w:trHeight w:val="360" w:hRule="auto"/>
         </w:trPr>
+        body6
         <w:tc>
           <w:tcPr>
             <w:tcBorders>
@@ -1879,6 +1885,7 @@
         <w:trPr>
           <w:trHeight w:val="360" w:hRule="auto"/>
         </w:trPr>
+        body7
         <w:tc>
           <w:tcPr>
             <w:tcBorders>
@@ -3635,6 +3642,7 @@
           <w:trHeight w:val="360" w:hRule="auto"/>
           <w:tblHeader/>
         </w:trPr>
+        header1
         <w:tc>
           <w:tcPr>
             <w:tcBorders>
@@ -4018,6 +4026,7 @@
         <w:trPr>
           <w:trHeight w:val="360" w:hRule="auto"/>
         </w:trPr>
+        body1
         <w:tc>
           <w:tcPr>
             <w:tcBorders>
@@ -4401,6 +4410,7 @@
         <w:trPr>
           <w:trHeight w:val="360" w:hRule="auto"/>
         </w:trPr>
+        body2
         <w:tc>
           <w:tcPr>
             <w:tcBorders>
@@ -4784,6 +4794,7 @@
         <w:trPr>
           <w:trHeight w:val="360" w:hRule="auto"/>
         </w:trPr>
+        body3
         <w:tc>
           <w:tcPr>
             <w:tcBorders>
@@ -5903,7 +5914,7 @@
         <w:pStyle w:val="BodyText"/>
       </w:pPr>
       <w:r>
-        <w:t xml:space="preserve">URL to the preregistered Stage 1 protocol: https://osf.io/kvjnm</w:t>
+        <w:t xml:space="preserve">This study was pre-registered as a Stage 1 Registered Report (https://osf.io/kvjnm) following in-principle acceptance on the 5/12/2025.</w:t>
       </w:r>
     </w:p>
     <w:bookmarkEnd w:id="60"/>

</xml_diff>